<commit_message>
Update reports and notebooks
</commit_message>
<xml_diff>
--- a/reports/CW1_TechnicalReport.docx
+++ b/reports/CW1_TechnicalReport.docx
@@ -53,7 +53,7 @@
         <w:t xml:space="preserve"> </w:t>
       </w:r>
       <w:r>
-        <w:t xml:space="preserve">Dispatch Lab: could the Sri Lankan grid have been scheduled better?</w:t>
+        <w:t xml:space="preserve">Day-ahead unit commitment for the Sri Lankan power grid: could it have been scheduled better?</w:t>
       </w:r>
     </w:p>
     <w:p>
@@ -115,13 +115,13 @@
         <w:br w:type="page"/>
       </w:r>
     </w:p>
-    <w:bookmarkStart w:id="46" w:name="X6a9909bb8ab486c50a2a4fa93e4eb642c488c12"/>
+    <w:bookmarkStart w:id="46" w:name="X14813b7ef48392976b66cb4659b21c6bc53810e"/>
     <w:p>
       <w:pPr>
         <w:pStyle w:val="Heading1"/>
       </w:pPr>
       <w:r>
-        <w:t xml:space="preserve">Dispatch Lab: could the Sri Lankan grid have been scheduled better?</w:t>
+        <w:t xml:space="preserve">Day-ahead unit commitment for the Sri Lankan power grid: could it have been scheduled better?</w:t>
       </w:r>
     </w:p>
     <w:p>

</xml_diff>